<commit_message>
fix domain and complete docx templates definition
</commit_message>
<xml_diff>
--- a/public/template/8. Tờ trinh PD BCKT-KT & KHLC NT.docx
+++ b/public/template/8. Tờ trinh PD BCKT-KT & KHLC NT.docx
@@ -1062,43 +1062,42 @@
           <w:highlight w:val="yellow"/>
           <w:lang w:val="en-US"/>
         </w:rPr>
-        <w:t>{bid_package</w:t>
-      </w:r>
-      <w:r>
-        <w:rPr>
-          <w:rFonts w:hint="default" w:ascii="Times New Roman" w:eastAsia="SimSun"/>
+        <w:t>{TV_bid_package.contract_no}</w:t>
+      </w:r>
+      <w:r>
+        <w:rPr>
+          <w:rFonts w:eastAsia="SimSun"/>
           <w:b w:val="0"/>
           <w:color w:val="000000"/>
           <w:spacing w:val="-4"/>
           <w:szCs w:val="22"/>
-          <w:highlight w:val="yellow"/>
-          <w:lang w:val="vi-VN"/>
-        </w:rPr>
-        <w:t>s</w:t>
+          <w:lang w:val="nl-NL"/>
+        </w:rPr>
+        <w:t xml:space="preserve"> giữa </w:t>
+      </w:r>
+      <w:r>
+        <w:rPr>
+          <w:rFonts w:eastAsia="SimSun"/>
+          <w:b w:val="0"/>
+          <w:color w:val="000000"/>
+          <w:spacing w:val="-4"/>
+          <w:szCs w:val="22"/>
+          <w:lang w:val="en-GB"/>
+        </w:rPr>
+        <w:t xml:space="preserve">Chi nhánh TCT Trực thăng Việt Nam - Công ty TNHH - Công ty Trực thăng Miền Nam và </w:t>
       </w:r>
       <w:r>
         <w:rPr>
           <w:rFonts w:hint="default" w:eastAsia="SimSun"/>
           <w:b w:val="0"/>
+          <w:bCs/>
           <w:color w:val="000000"/>
           <w:spacing w:val="-4"/>
           <w:szCs w:val="22"/>
           <w:highlight w:val="yellow"/>
           <w:lang w:val="en-US"/>
         </w:rPr>
-        <w:t>[</w:t>
-      </w:r>
-      <w:r>
-        <w:rPr>
-          <w:rFonts w:hint="default" w:ascii="Times New Roman" w:eastAsia="SimSun"/>
-          <w:b w:val="0"/>
-          <w:color w:val="000000"/>
-          <w:spacing w:val="-4"/>
-          <w:szCs w:val="22"/>
-          <w:highlight w:val="yellow"/>
-          <w:lang w:val="vi-VN"/>
-        </w:rPr>
-        <w:t>2</w:t>
+        <w:t>{</w:t>
       </w:r>
       <w:r>
         <w:rPr>
@@ -1110,29 +1109,7 @@
           <w:highlight w:val="yellow"/>
           <w:lang w:val="en-US"/>
         </w:rPr>
-        <w:t>].contract_no}</w:t>
-      </w:r>
-      <w:r>
-        <w:rPr>
-          <w:rFonts w:eastAsia="SimSun"/>
-          <w:b w:val="0"/>
-          <w:color w:val="000000"/>
-          <w:spacing w:val="-4"/>
-          <w:szCs w:val="22"/>
-          <w:lang w:val="nl-NL"/>
-        </w:rPr>
-        <w:t xml:space="preserve"> giữa </w:t>
-      </w:r>
-      <w:r>
-        <w:rPr>
-          <w:rFonts w:eastAsia="SimSun"/>
-          <w:b w:val="0"/>
-          <w:color w:val="000000"/>
-          <w:spacing w:val="-4"/>
-          <w:szCs w:val="22"/>
-          <w:lang w:val="en-GB"/>
-        </w:rPr>
-        <w:t xml:space="preserve">Chi nhánh TCT Trực thăng Việt Nam - Công ty TNHH - Công ty Trực thăng Miền Nam và </w:t>
+        <w:t>TV_bid_package</w:t>
       </w:r>
       <w:r>
         <w:rPr>
@@ -1145,22 +1122,7 @@
           <w:highlight w:val="yellow"/>
           <w:lang w:val="en-US"/>
         </w:rPr>
-        <w:t>{bid_packages[2].successful_bidder</w:t>
-      </w:r>
-      <w:bookmarkStart w:id="6" w:name="_GoBack"/>
-      <w:bookmarkEnd w:id="6"/>
-      <w:r>
-        <w:rPr>
-          <w:rFonts w:hint="default" w:eastAsia="SimSun"/>
-          <w:b w:val="0"/>
-          <w:bCs/>
-          <w:color w:val="000000"/>
-          <w:spacing w:val="-4"/>
-          <w:szCs w:val="22"/>
-          <w:highlight w:val="yellow"/>
-          <w:lang w:val="en-US"/>
-        </w:rPr>
-        <w:t>.name}</w:t>
+        <w:t>.successful_bidder.name}</w:t>
       </w:r>
       <w:r>
         <w:rPr>
@@ -1270,11 +1232,23 @@
       </w:r>
       <w:r>
         <w:rPr>
+          <w:rFonts w:hint="default"/>
           <w:i/>
           <w:highlight w:val="yellow"/>
-          <w:lang w:val="pt-BR"/>
-        </w:rPr>
-        <w:t>Sửa chữa Bó vỉa betong đường vào Kho Xăng dầu</w:t>
+          <w:lang w:val="en-US"/>
+        </w:rPr>
+        <w:t>{n</w:t>
+      </w:r>
+      <w:bookmarkStart w:id="6" w:name="_GoBack"/>
+      <w:bookmarkEnd w:id="6"/>
+      <w:r>
+        <w:rPr>
+          <w:rFonts w:hint="default"/>
+          <w:i/>
+          <w:highlight w:val="yellow"/>
+          <w:lang w:val="en-US"/>
+        </w:rPr>
+        <w:t>ame}</w:t>
       </w:r>
       <w:r>
         <w:rPr>
@@ -1293,14 +1267,46 @@
       </w:r>
       <w:r>
         <w:rPr>
-          <w:lang w:val="nl-NL"/>
-        </w:rPr>
-        <w:t>Công ty TNHH Đầu tư Xây dựng HDK</w:t>
-      </w:r>
-      <w:r>
-        <w:rPr>
-          <w:b/>
+          <w:rFonts w:hint="default" w:eastAsia="SimSun"/>
+          <w:b w:val="0"/>
           <w:bCs/>
+          <w:color w:val="000000"/>
+          <w:spacing w:val="-4"/>
+          <w:szCs w:val="22"/>
+          <w:highlight w:val="yellow"/>
+          <w:lang w:val="en-US"/>
+        </w:rPr>
+        <w:t>{</w:t>
+      </w:r>
+      <w:r>
+        <w:rPr>
+          <w:rFonts w:hint="default" w:eastAsia="SimSun"/>
+          <w:b w:val="0"/>
+          <w:color w:val="000000"/>
+          <w:spacing w:val="-4"/>
+          <w:szCs w:val="22"/>
+          <w:highlight w:val="yellow"/>
+          <w:lang w:val="en-US"/>
+        </w:rPr>
+        <w:t>TV_bid_package</w:t>
+      </w:r>
+      <w:r>
+        <w:rPr>
+          <w:rFonts w:hint="default" w:eastAsia="SimSun"/>
+          <w:b w:val="0"/>
+          <w:bCs/>
+          <w:color w:val="000000"/>
+          <w:spacing w:val="-4"/>
+          <w:szCs w:val="22"/>
+          <w:highlight w:val="yellow"/>
+          <w:lang w:val="en-US"/>
+        </w:rPr>
+        <w:t>.successful_bidder.name}</w:t>
+      </w:r>
+      <w:r>
+        <w:rPr>
+          <w:rFonts w:hint="default"/>
+          <w:lang w:val="en-US"/>
         </w:rPr>
         <w:t xml:space="preserve"> </w:t>
       </w:r>
@@ -1356,11 +1362,12 @@
       </w:r>
       <w:r>
         <w:rPr>
+          <w:rFonts w:hint="default"/>
           <w:i/>
           <w:highlight w:val="yellow"/>
-          <w:lang w:val="pt-BR"/>
-        </w:rPr>
-        <w:t>Sửa chữa Bó vỉa betong đường vào Kho Xăng dầu</w:t>
+          <w:lang w:val="en-US"/>
+        </w:rPr>
+        <w:t>{name}</w:t>
       </w:r>
       <w:r>
         <w:rPr>
@@ -1473,12 +1480,13 @@
       </w:r>
       <w:r>
         <w:rPr>
+          <w:rFonts w:hint="default"/>
           <w:i/>
           <w:spacing w:val="8"/>
           <w:highlight w:val="yellow"/>
-          <w:lang w:val="pt-BR"/>
-        </w:rPr>
-        <w:t>Sửa chữa Bó vỉa betong đường vào Kho Xăng dầu</w:t>
+          <w:lang w:val="en-US"/>
+        </w:rPr>
+        <w:t>{name}</w:t>
       </w:r>
       <w:r>
         <w:rPr>
@@ -1512,7 +1520,45 @@
           <w:spacing w:val="8"/>
           <w:lang w:val="nl-NL"/>
         </w:rPr>
-        <w:t xml:space="preserve"> Công ty TNHH Đầu tư Xây dựng HDK</w:t>
+        <w:t xml:space="preserve"> </w:t>
+      </w:r>
+      <w:r>
+        <w:rPr>
+          <w:rFonts w:hint="default" w:eastAsia="SimSun"/>
+          <w:b w:val="0"/>
+          <w:bCs/>
+          <w:color w:val="000000"/>
+          <w:spacing w:val="-4"/>
+          <w:szCs w:val="22"/>
+          <w:highlight w:val="yellow"/>
+          <w:lang w:val="en-US"/>
+        </w:rPr>
+        <w:t>{</w:t>
+      </w:r>
+      <w:r>
+        <w:rPr>
+          <w:rFonts w:hint="default" w:eastAsia="SimSun"/>
+          <w:b w:val="0"/>
+          <w:color w:val="000000"/>
+          <w:spacing w:val="-4"/>
+          <w:szCs w:val="22"/>
+          <w:highlight w:val="yellow"/>
+          <w:lang w:val="en-US"/>
+        </w:rPr>
+        <w:t>TV_bid_package</w:t>
+      </w:r>
+      <w:r>
+        <w:rPr>
+          <w:rFonts w:hint="default" w:eastAsia="SimSun"/>
+          <w:b w:val="0"/>
+          <w:bCs/>
+          <w:color w:val="000000"/>
+          <w:spacing w:val="-4"/>
+          <w:szCs w:val="22"/>
+          <w:highlight w:val="yellow"/>
+          <w:lang w:val="en-US"/>
+        </w:rPr>
+        <w:t>.successful_bidder.name}</w:t>
       </w:r>
       <w:r>
         <w:rPr>
@@ -1554,31 +1600,19 @@
       </w:r>
       <w:r>
         <w:rPr>
+          <w:rFonts w:hint="default"/>
           <w:bCs/>
           <w:kern w:val="16"/>
           <w:highlight w:val="yellow"/>
-        </w:rPr>
-        <w:t xml:space="preserve">Bó vỉa betong đường vào Kho xăng dầu </w:t>
+          <w:lang w:val="en-US"/>
+        </w:rPr>
+        <w:t>{existing_condition_of_the_structure}</w:t>
       </w:r>
       <w:r>
         <w:rPr>
           <w:highlight w:val="yellow"/>
         </w:rPr>
-        <w:t>chất lượng bê tông xuống cấp</w:t>
-      </w:r>
-      <w:r>
-        <w:rPr>
-          <w:bCs/>
-          <w:kern w:val="16"/>
-          <w:highlight w:val="yellow"/>
-        </w:rPr>
-        <w:t xml:space="preserve">, </w:t>
-      </w:r>
-      <w:r>
-        <w:rPr>
-          <w:highlight w:val="yellow"/>
-        </w:rPr>
-        <w:t>nhiều vị trí sụt lún nứt gãy.</w:t>
+        <w:t>.</w:t>
       </w:r>
     </w:p>
     <w:p>
@@ -1592,9 +1626,17 @@
       </w:r>
       <w:r>
         <w:rPr>
+          <w:rFonts w:hint="default"/>
           <w:highlight w:val="yellow"/>
-        </w:rPr>
-        <w:t>Phá dỡ bó vỉa cũ, đổ betong Bó vỉa mới theo tiêu chuẩn kỹ thuật và Bản vẽ thiết kế.</w:t>
+          <w:lang w:val="en-US"/>
+        </w:rPr>
+        <w:t>{repair_scope}</w:t>
+      </w:r>
+      <w:r>
+        <w:rPr>
+          <w:highlight w:val="yellow"/>
+        </w:rPr>
+        <w:t>.</w:t>
       </w:r>
     </w:p>
     <w:p>
@@ -1619,6 +1661,7 @@
         <w:jc w:val="both"/>
         <w:rPr>
           <w:spacing w:val="-8"/>
+          <w:highlight w:val="yellow"/>
           <w:lang w:val="nl-NL"/>
         </w:rPr>
       </w:pPr>
@@ -1631,18 +1674,28 @@
       </w:r>
       <w:r>
         <w:rPr>
+          <w:rFonts w:hint="default"/>
           <w:b/>
           <w:bCs/>
           <w:highlight w:val="yellow"/>
-        </w:rPr>
-        <w:t xml:space="preserve">792.078.397 </w:t>
+          <w:lang w:val="en-US"/>
+        </w:rPr>
+        <w:t>{est_cost}</w:t>
+      </w:r>
+      <w:r>
+        <w:rPr>
+          <w:b/>
+          <w:bCs/>
+          <w:highlight w:val="none"/>
+        </w:rPr>
+        <w:t xml:space="preserve"> </w:t>
       </w:r>
       <w:r>
         <w:rPr>
           <w:b/>
           <w:bCs/>
           <w:spacing w:val="-8"/>
-          <w:highlight w:val="yellow"/>
+          <w:highlight w:val="none"/>
           <w:lang w:val="nl-NL"/>
         </w:rPr>
         <w:t>đồng</w:t>
@@ -1650,7 +1703,7 @@
       <w:r>
         <w:rPr>
           <w:spacing w:val="-8"/>
-          <w:highlight w:val="yellow"/>
+          <w:highlight w:val="none"/>
           <w:lang w:val="nl-NL"/>
         </w:rPr>
         <w:t xml:space="preserve">  </w:t>
@@ -1659,24 +1712,25 @@
         <w:rPr>
           <w:i/>
           <w:spacing w:val="-8"/>
-          <w:highlight w:val="yellow"/>
+          <w:highlight w:val="none"/>
           <w:lang w:val="nl-NL"/>
         </w:rPr>
         <w:t xml:space="preserve">(Bằng chữ: </w:t>
       </w:r>
       <w:r>
         <w:rPr>
+          <w:rFonts w:hint="default"/>
           <w:i/>
           <w:highlight w:val="yellow"/>
-          <w:lang w:val="nl-NL"/>
-        </w:rPr>
-        <w:t>Bảy trăm chín mươi hai triệu, không trăm bảy mươi tám nghìn, ba trăm chín mươi bảy đồng</w:t>
+          <w:lang w:val="en-US"/>
+        </w:rPr>
+        <w:t>{est_cost_str}</w:t>
       </w:r>
       <w:r>
         <w:rPr>
           <w:i/>
           <w:spacing w:val="-8"/>
-          <w:highlight w:val="yellow"/>
+          <w:highlight w:val="none"/>
           <w:lang w:val="nl-NL"/>
         </w:rPr>
         <w:t>./.)</w:t>
@@ -1716,18 +1770,26 @@
         <w:spacing w:before="120"/>
         <w:ind w:firstLine="720"/>
         <w:jc w:val="both"/>
+        <w:rPr>
+          <w:highlight w:val="none"/>
+        </w:rPr>
       </w:pPr>
       <w:r>
         <w:t xml:space="preserve">+ Chi phí thi công sửa chữa: </w:t>
       </w:r>
       <w:r>
         <w:rPr>
+          <w:rFonts w:hint="default"/>
           <w:highlight w:val="yellow"/>
-        </w:rPr>
-        <w:t>743.756.519 đồng;</w:t>
-      </w:r>
-      <w:r>
-        <w:t xml:space="preserve"> </w:t>
+          <w:lang w:val="en-US"/>
+        </w:rPr>
+        <w:t>{TC_bid_package.est_cost}</w:t>
+      </w:r>
+      <w:r>
+        <w:rPr>
+          <w:highlight w:val="none"/>
+        </w:rPr>
+        <w:t xml:space="preserve"> đồng; </w:t>
       </w:r>
     </w:p>
     <w:p>
@@ -1735,18 +1797,26 @@
         <w:spacing w:before="120"/>
         <w:ind w:firstLine="720"/>
         <w:jc w:val="both"/>
+        <w:rPr>
+          <w:highlight w:val="none"/>
+        </w:rPr>
       </w:pPr>
       <w:r>
         <w:t xml:space="preserve">+ Chi phí tư vấn lập BCKTKT: </w:t>
       </w:r>
       <w:r>
         <w:rPr>
+          <w:rFonts w:hint="default"/>
           <w:highlight w:val="yellow"/>
-        </w:rPr>
-        <w:t>43.137.878 đồng;</w:t>
-      </w:r>
-      <w:r>
-        <w:t xml:space="preserve"> </w:t>
+          <w:lang w:val="en-US"/>
+        </w:rPr>
+        <w:t>{TV_bid_package.est_cost}</w:t>
+      </w:r>
+      <w:r>
+        <w:rPr>
+          <w:highlight w:val="none"/>
+        </w:rPr>
+        <w:t xml:space="preserve"> đồng; </w:t>
       </w:r>
     </w:p>
     <w:p>
@@ -1754,15 +1824,26 @@
         <w:spacing w:before="120"/>
         <w:ind w:firstLine="720"/>
         <w:jc w:val="both"/>
+        <w:rPr>
+          <w:highlight w:val="none"/>
+        </w:rPr>
       </w:pPr>
       <w:r>
         <w:t xml:space="preserve">+ Chi phí thẩm tra BCKTKT: </w:t>
       </w:r>
       <w:r>
         <w:rPr>
+          <w:rFonts w:hint="default"/>
           <w:highlight w:val="yellow"/>
-        </w:rPr>
-        <w:t>5.184.000 đồng.</w:t>
+          <w:lang w:val="en-US"/>
+        </w:rPr>
+        <w:t>{TT_bid_package.est_cost}</w:t>
+      </w:r>
+      <w:r>
+        <w:rPr>
+          <w:highlight w:val="none"/>
+        </w:rPr>
+        <w:t xml:space="preserve"> đồng.</w:t>
       </w:r>
       <w:bookmarkEnd w:id="2"/>
     </w:p>
@@ -1793,11 +1874,20 @@
       </w:r>
       <w:r>
         <w:rPr>
+          <w:rFonts w:hint="default"/>
+          <w:color w:val="000000"/>
+          <w:highlight w:val="yellow"/>
+          <w:lang w:val="en-US"/>
+        </w:rPr>
+        <w:t>{source_of_funds}</w:t>
+      </w:r>
+      <w:r>
+        <w:rPr>
           <w:color w:val="000000"/>
           <w:highlight w:val="yellow"/>
           <w:lang w:val="nl-NL"/>
         </w:rPr>
-        <w:t>2025.</w:t>
+        <w:t>.</w:t>
       </w:r>
     </w:p>
     <w:p>
@@ -1822,36 +1912,46 @@
       <w:r>
         <w:rPr>
           <w:color w:val="000000"/>
+          <w:highlight w:val="none"/>
+          <w:lang w:val="nl-NL"/>
+        </w:rPr>
+        <w:t>Từ</w:t>
+      </w:r>
+      <w:r>
+        <w:rPr>
+          <w:rFonts w:hint="default"/>
+          <w:color w:val="000000"/>
+          <w:highlight w:val="none"/>
+          <w:lang w:val="en-US"/>
+        </w:rPr>
+        <w:t xml:space="preserve"> </w:t>
+      </w:r>
+      <w:r>
+        <w:rPr>
+          <w:rFonts w:hint="default"/>
+          <w:color w:val="000000"/>
+          <w:highlight w:val="yellow"/>
+          <w:lang w:val="en-US"/>
+        </w:rPr>
+        <w:t>{impl_duration</w:t>
+      </w:r>
+      <w:bookmarkEnd w:id="3"/>
+      <w:r>
+        <w:rPr>
+          <w:rFonts w:hint="default"/>
+          <w:color w:val="000000"/>
+          <w:highlight w:val="yellow"/>
+          <w:lang w:val="en-US"/>
+        </w:rPr>
+        <w:t>}</w:t>
+      </w:r>
+      <w:r>
+        <w:rPr>
+          <w:color w:val="000000"/>
           <w:highlight w:val="yellow"/>
           <w:lang w:val="nl-NL"/>
         </w:rPr>
-        <w:t>Từ</w:t>
-      </w:r>
-      <w:r>
-        <w:rPr>
-          <w:b/>
-          <w:color w:val="000000"/>
-          <w:highlight w:val="yellow"/>
-          <w:lang w:val="nl-NL"/>
-        </w:rPr>
-        <w:t xml:space="preserve"> </w:t>
-      </w:r>
-      <w:r>
-        <w:rPr>
-          <w:color w:val="000000"/>
-          <w:highlight w:val="yellow"/>
-          <w:lang w:val="nl-NL"/>
-        </w:rPr>
-        <w:t>tháng 10 - tháng 12/202</w:t>
-      </w:r>
-      <w:bookmarkEnd w:id="3"/>
-      <w:r>
-        <w:rPr>
-          <w:color w:val="000000"/>
-          <w:highlight w:val="yellow"/>
-          <w:lang w:val="nl-NL"/>
-        </w:rPr>
-        <w:t>5.</w:t>
+        <w:t>.</w:t>
       </w:r>
     </w:p>
     <w:p>
@@ -2142,12 +2242,6 @@
             <w:insideH w:val="single" w:color="auto" w:sz="4" w:space="0"/>
             <w:insideV w:val="single" w:color="auto" w:sz="4" w:space="0"/>
           </w:tblBorders>
-          <w:tblCellMar>
-            <w:top w:w="0" w:type="dxa"/>
-            <w:left w:w="108" w:type="dxa"/>
-            <w:bottom w:w="0" w:type="dxa"/>
-            <w:right w:w="108" w:type="dxa"/>
-          </w:tblCellMar>
         </w:tblPrEx>
         <w:trPr>
           <w:trHeight w:val="735" w:hRule="atLeast"/>
@@ -2169,14 +2263,14 @@
             <w:pPr>
               <w:jc w:val="center"/>
               <w:rPr>
-                <w:sz w:val="24"/>
-                <w:szCs w:val="24"/>
-              </w:rPr>
-            </w:pPr>
-            <w:r>
-              <w:rPr>
-                <w:sz w:val="24"/>
-                <w:szCs w:val="24"/>
+                <w:sz w:val="22"/>
+                <w:szCs w:val="22"/>
+              </w:rPr>
+            </w:pPr>
+            <w:r>
+              <w:rPr>
+                <w:sz w:val="22"/>
+                <w:szCs w:val="22"/>
               </w:rPr>
               <w:t>1</w:t>
             </w:r>
@@ -2199,14 +2293,14 @@
             <w:pPr>
               <w:jc w:val="both"/>
               <w:rPr>
-                <w:sz w:val="24"/>
-                <w:szCs w:val="24"/>
-              </w:rPr>
-            </w:pPr>
-            <w:r>
-              <w:rPr>
-                <w:sz w:val="24"/>
-                <w:szCs w:val="24"/>
+                <w:sz w:val="22"/>
+                <w:szCs w:val="22"/>
+              </w:rPr>
+            </w:pPr>
+            <w:r>
+              <w:rPr>
+                <w:sz w:val="22"/>
+                <w:szCs w:val="22"/>
               </w:rPr>
               <w:t>Tư vấn lập BCKTKT</w:t>
             </w:r>
@@ -2240,18 +2334,52 @@
               </w:tabs>
               <w:jc w:val="both"/>
               <w:rPr>
-                <w:sz w:val="24"/>
-                <w:szCs w:val="24"/>
-                <w:lang w:val="pt-BR"/>
-              </w:rPr>
-            </w:pPr>
-            <w:r>
-              <w:rPr>
-                <w:bCs/>
-                <w:sz w:val="24"/>
-                <w:szCs w:val="24"/>
-              </w:rPr>
-              <w:t>Công ty TNHH Đầu tư Xây dựng HDK</w:t>
+                <w:rFonts w:hint="default"/>
+                <w:sz w:val="22"/>
+                <w:szCs w:val="22"/>
+                <w:lang w:val="en-US"/>
+              </w:rPr>
+            </w:pPr>
+            <w:r>
+              <w:rPr>
+                <w:rFonts w:hint="default" w:eastAsia="SimSun"/>
+                <w:b w:val="0"/>
+                <w:bCs/>
+                <w:color w:val="000000"/>
+                <w:spacing w:val="-4"/>
+                <w:sz w:val="22"/>
+                <w:szCs w:val="22"/>
+                <w:highlight w:val="yellow"/>
+                <w:lang w:val="en-US"/>
+              </w:rPr>
+              <w:t>{</w:t>
+            </w:r>
+            <w:r>
+              <w:rPr>
+                <w:rFonts w:hint="default" w:eastAsia="SimSun"/>
+                <w:b w:val="0"/>
+                <w:color w:val="000000"/>
+                <w:spacing w:val="-4"/>
+                <w:sz w:val="22"/>
+                <w:szCs w:val="22"/>
+                <w:highlight w:val="yellow"/>
+                <w:lang w:val="en-US"/>
+              </w:rPr>
+              <w:t>TV_bid_package</w:t>
+            </w:r>
+            <w:r>
+              <w:rPr>
+                <w:rFonts w:hint="default" w:eastAsia="SimSun"/>
+                <w:b w:val="0"/>
+                <w:bCs/>
+                <w:color w:val="000000"/>
+                <w:spacing w:val="-4"/>
+                <w:sz w:val="22"/>
+                <w:szCs w:val="22"/>
+                <w:highlight w:val="yellow"/>
+                <w:lang w:val="en-US"/>
+              </w:rPr>
+              <w:t>.successful_bidder.name}</w:t>
             </w:r>
           </w:p>
         </w:tc>
@@ -2272,18 +2400,51 @@
             <w:pPr>
               <w:jc w:val="right"/>
               <w:rPr>
-                <w:sz w:val="24"/>
-                <w:szCs w:val="24"/>
+                <w:sz w:val="22"/>
+                <w:szCs w:val="22"/>
                 <w:highlight w:val="yellow"/>
               </w:rPr>
             </w:pPr>
             <w:r>
               <w:rPr>
-                <w:sz w:val="24"/>
-                <w:szCs w:val="24"/>
+                <w:rFonts w:hint="default" w:eastAsia="SimSun"/>
+                <w:b w:val="0"/>
+                <w:bCs/>
+                <w:color w:val="000000"/>
+                <w:spacing w:val="-4"/>
+                <w:sz w:val="22"/>
+                <w:szCs w:val="22"/>
                 <w:highlight w:val="yellow"/>
-              </w:rPr>
-              <w:t>43.137.878</w:t>
+                <w:lang w:val="en-US"/>
+              </w:rPr>
+              <w:t>{</w:t>
+            </w:r>
+            <w:r>
+              <w:rPr>
+                <w:rFonts w:hint="default" w:eastAsia="SimSun"/>
+                <w:b w:val="0"/>
+                <w:color w:val="000000"/>
+                <w:spacing w:val="-4"/>
+                <w:sz w:val="22"/>
+                <w:szCs w:val="22"/>
+                <w:highlight w:val="yellow"/>
+                <w:lang w:val="en-US"/>
+              </w:rPr>
+              <w:t>TV_bid_package</w:t>
+            </w:r>
+            <w:r>
+              <w:rPr>
+                <w:rFonts w:hint="default" w:eastAsia="SimSun"/>
+                <w:b w:val="0"/>
+                <w:bCs/>
+                <w:color w:val="000000"/>
+                <w:spacing w:val="-4"/>
+                <w:sz w:val="22"/>
+                <w:szCs w:val="22"/>
+                <w:highlight w:val="yellow"/>
+                <w:lang w:val="en-US"/>
+              </w:rPr>
+              <w:t>.est_cost}</w:t>
             </w:r>
           </w:p>
         </w:tc>
@@ -2301,20 +2462,72 @@
           </w:tcPr>
           <w:p>
             <w:pPr>
-              <w:jc w:val="center"/>
-              <w:rPr>
-                <w:sz w:val="24"/>
-                <w:szCs w:val="24"/>
+              <w:spacing w:line="240" w:lineRule="auto"/>
+              <w:jc w:val="center"/>
+              <w:rPr>
+                <w:rFonts w:hint="default"/>
+                <w:sz w:val="22"/>
+                <w:szCs w:val="22"/>
                 <w:highlight w:val="yellow"/>
-              </w:rPr>
-            </w:pPr>
-            <w:r>
-              <w:rPr>
-                <w:sz w:val="24"/>
-                <w:szCs w:val="24"/>
+                <w:lang w:val="en-US"/>
+              </w:rPr>
+            </w:pPr>
+            <w:r>
+              <w:rPr>
+                <w:rFonts w:hint="default"/>
+                <w:sz w:val="22"/>
+                <w:szCs w:val="22"/>
                 <w:highlight w:val="yellow"/>
-              </w:rPr>
-              <w:t>QĐ số 834A/QĐ-TTMN ngày 15/10/2025</w:t>
+                <w:lang w:val="en-US"/>
+              </w:rPr>
+              <w:t>Q</w:t>
+            </w:r>
+            <w:r>
+              <w:rPr>
+                <w:rFonts w:hint="default" w:ascii="Times New Roman"/>
+                <w:sz w:val="22"/>
+                <w:szCs w:val="22"/>
+                <w:highlight w:val="yellow"/>
+                <w:lang w:val="vi-VN"/>
+              </w:rPr>
+              <w:t xml:space="preserve">Đ số </w:t>
+            </w:r>
+            <w:r>
+              <w:rPr>
+                <w:rFonts w:hint="default"/>
+                <w:sz w:val="22"/>
+                <w:szCs w:val="22"/>
+                <w:highlight w:val="yellow"/>
+                <w:lang w:val="en-US"/>
+              </w:rPr>
+              <w:t>{</w:t>
+            </w:r>
+            <w:r>
+              <w:rPr>
+                <w:rFonts w:hint="default" w:eastAsia="SimSun"/>
+                <w:b w:val="0"/>
+                <w:color w:val="000000"/>
+                <w:spacing w:val="-4"/>
+                <w:sz w:val="22"/>
+                <w:szCs w:val="22"/>
+                <w:highlight w:val="yellow"/>
+                <w:lang w:val="en-US"/>
+              </w:rPr>
+              <w:t>TV_bid_package</w:t>
+            </w:r>
+            <w:r>
+              <w:rPr>
+                <w:rFonts w:hint="default" w:eastAsia="SimSun"/>
+                <w:b w:val="0"/>
+                <w:bCs/>
+                <w:color w:val="000000"/>
+                <w:spacing w:val="-4"/>
+                <w:sz w:val="22"/>
+                <w:szCs w:val="22"/>
+                <w:highlight w:val="yellow"/>
+                <w:lang w:val="en-US"/>
+              </w:rPr>
+              <w:t>.approval_no}</w:t>
             </w:r>
           </w:p>
         </w:tc>
@@ -2329,12 +2542,6 @@
             <w:insideH w:val="single" w:color="auto" w:sz="4" w:space="0"/>
             <w:insideV w:val="single" w:color="auto" w:sz="4" w:space="0"/>
           </w:tblBorders>
-          <w:tblCellMar>
-            <w:top w:w="0" w:type="dxa"/>
-            <w:left w:w="108" w:type="dxa"/>
-            <w:bottom w:w="0" w:type="dxa"/>
-            <w:right w:w="108" w:type="dxa"/>
-          </w:tblCellMar>
         </w:tblPrEx>
         <w:trPr>
           <w:trHeight w:val="729" w:hRule="atLeast"/>
@@ -2356,14 +2563,14 @@
             <w:pPr>
               <w:jc w:val="center"/>
               <w:rPr>
-                <w:sz w:val="24"/>
-                <w:szCs w:val="24"/>
-              </w:rPr>
-            </w:pPr>
-            <w:r>
-              <w:rPr>
-                <w:sz w:val="24"/>
-                <w:szCs w:val="24"/>
+                <w:sz w:val="22"/>
+                <w:szCs w:val="22"/>
+              </w:rPr>
+            </w:pPr>
+            <w:r>
+              <w:rPr>
+                <w:sz w:val="22"/>
+                <w:szCs w:val="22"/>
               </w:rPr>
               <w:t>2</w:t>
             </w:r>
@@ -2386,14 +2593,14 @@
             <w:pPr>
               <w:jc w:val="both"/>
               <w:rPr>
-                <w:sz w:val="24"/>
-                <w:szCs w:val="24"/>
-              </w:rPr>
-            </w:pPr>
-            <w:r>
-              <w:rPr>
-                <w:sz w:val="24"/>
-                <w:szCs w:val="24"/>
+                <w:sz w:val="22"/>
+                <w:szCs w:val="22"/>
+              </w:rPr>
+            </w:pPr>
+            <w:r>
+              <w:rPr>
+                <w:sz w:val="22"/>
+                <w:szCs w:val="22"/>
               </w:rPr>
               <w:t>Thẩm tra BCKTKT</w:t>
             </w:r>
@@ -2415,16 +2622,76 @@
           <w:p>
             <w:pPr>
               <w:rPr>
-                <w:sz w:val="24"/>
-                <w:szCs w:val="24"/>
-              </w:rPr>
-            </w:pPr>
-            <w:r>
-              <w:rPr>
-                <w:sz w:val="24"/>
-                <w:szCs w:val="24"/>
-              </w:rPr>
-              <w:t>Công ty TNHH Xây dựng Tổng hợp Toàn Thịnh</w:t>
+                <w:sz w:val="22"/>
+                <w:szCs w:val="22"/>
+              </w:rPr>
+            </w:pPr>
+            <w:r>
+              <w:rPr>
+                <w:rFonts w:hint="default" w:eastAsia="SimSun"/>
+                <w:b w:val="0"/>
+                <w:bCs/>
+                <w:color w:val="000000"/>
+                <w:spacing w:val="-4"/>
+                <w:sz w:val="22"/>
+                <w:szCs w:val="22"/>
+                <w:highlight w:val="yellow"/>
+                <w:lang w:val="en-US"/>
+              </w:rPr>
+              <w:t>{</w:t>
+            </w:r>
+            <w:r>
+              <w:rPr>
+                <w:rFonts w:hint="default" w:eastAsia="SimSun"/>
+                <w:b w:val="0"/>
+                <w:color w:val="000000"/>
+                <w:spacing w:val="-4"/>
+                <w:sz w:val="22"/>
+                <w:szCs w:val="22"/>
+                <w:highlight w:val="yellow"/>
+                <w:lang w:val="en-US"/>
+              </w:rPr>
+              <w:t>T</w:t>
+            </w:r>
+            <w:r>
+              <w:rPr>
+                <w:rFonts w:hint="default" w:ascii="Times New Roman" w:eastAsia="SimSun"/>
+                <w:b w:val="0"/>
+                <w:color w:val="000000"/>
+                <w:spacing w:val="-4"/>
+                <w:sz w:val="22"/>
+                <w:szCs w:val="22"/>
+                <w:highlight w:val="yellow"/>
+                <w:lang w:val="vi-VN"/>
+              </w:rPr>
+              <w:t>T</w:t>
+            </w:r>
+            <w:r>
+              <w:rPr>
+                <w:rFonts w:hint="default" w:eastAsia="SimSun"/>
+                <w:b w:val="0"/>
+                <w:color w:val="000000"/>
+                <w:spacing w:val="-4"/>
+                <w:sz w:val="22"/>
+                <w:szCs w:val="22"/>
+                <w:highlight w:val="yellow"/>
+                <w:lang w:val="en-US"/>
+              </w:rPr>
+              <w:t>_bid_package</w:t>
+            </w:r>
+            <w:r>
+              <w:rPr>
+                <w:rFonts w:hint="default" w:eastAsia="SimSun"/>
+                <w:b w:val="0"/>
+                <w:bCs/>
+                <w:color w:val="000000"/>
+                <w:spacing w:val="-4"/>
+                <w:sz w:val="22"/>
+                <w:szCs w:val="22"/>
+                <w:highlight w:val="yellow"/>
+                <w:lang w:val="en-US"/>
+              </w:rPr>
+              <w:t>.successful_bidder.name}</w:t>
             </w:r>
           </w:p>
         </w:tc>
@@ -2445,18 +2712,63 @@
             <w:pPr>
               <w:jc w:val="right"/>
               <w:rPr>
-                <w:sz w:val="24"/>
-                <w:szCs w:val="24"/>
+                <w:rFonts w:hint="default"/>
+                <w:sz w:val="22"/>
+                <w:szCs w:val="22"/>
                 <w:highlight w:val="yellow"/>
-              </w:rPr>
-            </w:pPr>
-            <w:r>
-              <w:rPr>
-                <w:sz w:val="24"/>
-                <w:szCs w:val="24"/>
+                <w:lang w:val="vi-VN"/>
+              </w:rPr>
+            </w:pPr>
+            <w:r>
+              <w:rPr>
+                <w:rFonts w:hint="default" w:ascii="Times New Roman"/>
+                <w:sz w:val="22"/>
+                <w:szCs w:val="22"/>
                 <w:highlight w:val="yellow"/>
-              </w:rPr>
-              <w:t>5.184.000</w:t>
+                <w:lang w:val="vi-VN"/>
+              </w:rPr>
+              <w:t>{TT_</w:t>
+            </w:r>
+            <w:r>
+              <w:rPr>
+                <w:rFonts w:hint="default" w:eastAsia="SimSun"/>
+                <w:b w:val="0"/>
+                <w:color w:val="000000"/>
+                <w:spacing w:val="-4"/>
+                <w:sz w:val="22"/>
+                <w:szCs w:val="22"/>
+                <w:highlight w:val="yellow"/>
+                <w:lang w:val="en-US"/>
+              </w:rPr>
+              <w:t>bid_package</w:t>
+            </w:r>
+            <w:r>
+              <w:rPr>
+                <w:rFonts w:hint="default" w:eastAsia="SimSun"/>
+                <w:b w:val="0"/>
+                <w:bCs/>
+                <w:color w:val="000000"/>
+                <w:spacing w:val="-4"/>
+                <w:sz w:val="22"/>
+                <w:szCs w:val="22"/>
+                <w:highlight w:val="yellow"/>
+                <w:lang w:val="en-US"/>
+              </w:rPr>
+              <w:t>.est_cost</w:t>
+            </w:r>
+            <w:r>
+              <w:rPr>
+                <w:rFonts w:hint="default" w:ascii="Times New Roman" w:eastAsia="SimSun"/>
+                <w:b w:val="0"/>
+                <w:bCs/>
+                <w:color w:val="000000"/>
+                <w:spacing w:val="-4"/>
+                <w:sz w:val="22"/>
+                <w:szCs w:val="22"/>
+                <w:highlight w:val="yellow"/>
+                <w:lang w:val="vi-VN"/>
+              </w:rPr>
+              <w:t>}</w:t>
             </w:r>
           </w:p>
         </w:tc>
@@ -2476,18 +2788,81 @@
             <w:pPr>
               <w:jc w:val="center"/>
               <w:rPr>
-                <w:sz w:val="24"/>
-                <w:szCs w:val="24"/>
+                <w:sz w:val="22"/>
+                <w:szCs w:val="22"/>
                 <w:highlight w:val="yellow"/>
               </w:rPr>
             </w:pPr>
             <w:r>
               <w:rPr>
-                <w:sz w:val="24"/>
-                <w:szCs w:val="24"/>
+                <w:sz w:val="22"/>
+                <w:szCs w:val="22"/>
                 <w:highlight w:val="yellow"/>
               </w:rPr>
-              <w:t>QĐ số 843A/QĐ- TTMN ngày 20/10/2025</w:t>
+              <w:t xml:space="preserve">QĐ số </w:t>
+            </w:r>
+            <w:r>
+              <w:rPr>
+                <w:rFonts w:hint="default"/>
+                <w:sz w:val="22"/>
+                <w:szCs w:val="22"/>
+                <w:highlight w:val="yellow"/>
+                <w:lang w:val="en-US"/>
+              </w:rPr>
+              <w:t>{</w:t>
+            </w:r>
+            <w:r>
+              <w:rPr>
+                <w:rFonts w:hint="default" w:eastAsia="SimSun"/>
+                <w:b w:val="0"/>
+                <w:color w:val="000000"/>
+                <w:spacing w:val="-4"/>
+                <w:sz w:val="22"/>
+                <w:szCs w:val="22"/>
+                <w:highlight w:val="yellow"/>
+                <w:lang w:val="en-US"/>
+              </w:rPr>
+              <w:t>T</w:t>
+            </w:r>
+            <w:r>
+              <w:rPr>
+                <w:rFonts w:hint="default" w:ascii="Times New Roman" w:eastAsia="SimSun"/>
+                <w:b w:val="0"/>
+                <w:color w:val="000000"/>
+                <w:spacing w:val="-4"/>
+                <w:sz w:val="22"/>
+                <w:szCs w:val="22"/>
+                <w:highlight w:val="yellow"/>
+                <w:lang w:val="vi-VN"/>
+              </w:rPr>
+              <w:t>T</w:t>
+            </w:r>
+            <w:r>
+              <w:rPr>
+                <w:rFonts w:hint="default" w:eastAsia="SimSun"/>
+                <w:b w:val="0"/>
+                <w:color w:val="000000"/>
+                <w:spacing w:val="-4"/>
+                <w:sz w:val="22"/>
+                <w:szCs w:val="22"/>
+                <w:highlight w:val="yellow"/>
+                <w:lang w:val="en-US"/>
+              </w:rPr>
+              <w:t>_bid_package</w:t>
+            </w:r>
+            <w:r>
+              <w:rPr>
+                <w:rFonts w:hint="default" w:eastAsia="SimSun"/>
+                <w:b w:val="0"/>
+                <w:bCs/>
+                <w:color w:val="000000"/>
+                <w:spacing w:val="-4"/>
+                <w:sz w:val="22"/>
+                <w:szCs w:val="22"/>
+                <w:highlight w:val="yellow"/>
+                <w:lang w:val="en-US"/>
+              </w:rPr>
+              <w:t>.approval_no}</w:t>
             </w:r>
           </w:p>
         </w:tc>
@@ -2531,15 +2906,15 @@
               <w:jc w:val="center"/>
               <w:rPr>
                 <w:b/>
-                <w:sz w:val="24"/>
-                <w:szCs w:val="24"/>
-              </w:rPr>
-            </w:pPr>
-            <w:r>
-              <w:rPr>
-                <w:b/>
-                <w:sz w:val="24"/>
-                <w:szCs w:val="24"/>
+                <w:sz w:val="22"/>
+                <w:szCs w:val="22"/>
+              </w:rPr>
+            </w:pPr>
+            <w:r>
+              <w:rPr>
+                <w:b/>
+                <w:sz w:val="22"/>
+                <w:szCs w:val="22"/>
               </w:rPr>
               <w:t>Tổng cộng</w:t>
             </w:r>
@@ -2564,20 +2939,32 @@
               <w:rPr>
                 <w:b/>
                 <w:bCs/>
-                <w:sz w:val="24"/>
-                <w:szCs w:val="24"/>
+                <w:sz w:val="22"/>
+                <w:szCs w:val="22"/>
                 <w:highlight w:val="yellow"/>
               </w:rPr>
             </w:pPr>
             <w:r>
               <w:rPr>
-                <w:b/>
-                <w:bCs/>
-                <w:sz w:val="24"/>
-                <w:szCs w:val="24"/>
+                <w:rFonts w:hint="default"/>
+                <w:b/>
+                <w:bCs/>
+                <w:sz w:val="22"/>
+                <w:szCs w:val="22"/>
                 <w:highlight w:val="yellow"/>
-              </w:rPr>
-              <w:t xml:space="preserve">48.321.878 </w:t>
+                <w:lang w:val="en-US"/>
+              </w:rPr>
+              <w:t>{completed_works_total}</w:t>
+            </w:r>
+            <w:r>
+              <w:rPr>
+                <w:b/>
+                <w:bCs/>
+                <w:sz w:val="22"/>
+                <w:szCs w:val="22"/>
+                <w:highlight w:val="yellow"/>
+              </w:rPr>
+              <w:t xml:space="preserve"> </w:t>
             </w:r>
           </w:p>
         </w:tc>
@@ -2598,8 +2985,8 @@
               <w:jc w:val="right"/>
               <w:rPr>
                 <w:bCs/>
-                <w:sz w:val="24"/>
-                <w:szCs w:val="24"/>
+                <w:sz w:val="22"/>
+                <w:szCs w:val="22"/>
               </w:rPr>
             </w:pPr>
           </w:p>
@@ -3041,7 +3428,7 @@
       <w:tblPr>
         <w:tblStyle w:val="5"/>
         <w:tblpPr w:leftFromText="180" w:rightFromText="180" w:vertAnchor="text" w:horzAnchor="margin" w:tblpXSpec="center" w:tblpY="256"/>
-        <w:tblW w:w="5000" w:type="pct"/>
+        <w:tblW w:w="5062" w:type="pct"/>
         <w:tblInd w:w="-5" w:type="dxa"/>
         <w:tblBorders>
           <w:top w:val="single" w:color="auto" w:sz="4" w:space="0"/>
@@ -3051,7 +3438,7 @@
           <w:insideH w:val="single" w:color="auto" w:sz="4" w:space="0"/>
           <w:insideV w:val="single" w:color="auto" w:sz="4" w:space="0"/>
         </w:tblBorders>
-        <w:tblLayout w:type="autofit"/>
+        <w:tblLayout w:type="fixed"/>
         <w:tblCellMar>
           <w:top w:w="0" w:type="dxa"/>
           <w:left w:w="0" w:type="dxa"/>
@@ -3060,16 +3447,16 @@
         </w:tblCellMar>
       </w:tblPr>
       <w:tblGrid>
-        <w:gridCol w:w="441"/>
-        <w:gridCol w:w="1075"/>
-        <w:gridCol w:w="694"/>
-        <w:gridCol w:w="1418"/>
-        <w:gridCol w:w="1422"/>
-        <w:gridCol w:w="843"/>
-        <w:gridCol w:w="753"/>
-        <w:gridCol w:w="753"/>
-        <w:gridCol w:w="957"/>
-        <w:gridCol w:w="828"/>
+        <w:gridCol w:w="92"/>
+        <w:gridCol w:w="195"/>
+        <w:gridCol w:w="994"/>
+        <w:gridCol w:w="1038"/>
+        <w:gridCol w:w="1334"/>
+        <w:gridCol w:w="646"/>
+        <w:gridCol w:w="1526"/>
+        <w:gridCol w:w="1424"/>
+        <w:gridCol w:w="415"/>
+        <w:gridCol w:w="1634"/>
       </w:tblGrid>
       <w:tr>
         <w:tblPrEx>
@@ -3090,7 +3477,7 @@
         </w:tblPrEx>
         <w:tc>
           <w:tcPr>
-            <w:tcW w:w="240" w:type="pct"/>
+            <w:tcW w:w="50" w:type="pct"/>
             <w:vMerge w:val="restart"/>
             <w:tcBorders>
               <w:top w:val="single" w:color="auto" w:sz="4" w:space="0"/>
@@ -3129,7 +3516,7 @@
         </w:tc>
         <w:tc>
           <w:tcPr>
-            <w:tcW w:w="585" w:type="pct"/>
+            <w:tcW w:w="105" w:type="pct"/>
             <w:vMerge w:val="restart"/>
             <w:tcBorders>
               <w:top w:val="single" w:color="auto" w:sz="4" w:space="0"/>
@@ -3216,7 +3603,7 @@
         </w:tc>
         <w:tc>
           <w:tcPr>
-            <w:tcW w:w="1150" w:type="pct"/>
+            <w:tcW w:w="1092" w:type="pct"/>
             <w:gridSpan w:val="2"/>
             <w:tcBorders>
               <w:top w:val="single" w:color="auto" w:sz="4" w:space="0"/>
@@ -3265,7 +3652,7 @@
         </w:tc>
         <w:tc>
           <w:tcPr>
-            <w:tcW w:w="774" w:type="pct"/>
+            <w:tcW w:w="717" w:type="pct"/>
             <w:vMerge w:val="restart"/>
             <w:tcBorders>
               <w:top w:val="single" w:color="auto" w:sz="4" w:space="0"/>
@@ -3330,7 +3717,7 @@
         </w:tc>
         <w:tc>
           <w:tcPr>
-            <w:tcW w:w="459" w:type="pct"/>
+            <w:tcW w:w="347" w:type="pct"/>
             <w:vMerge w:val="restart"/>
             <w:tcBorders>
               <w:top w:val="single" w:color="auto" w:sz="4" w:space="0"/>
@@ -3394,7 +3781,7 @@
         </w:tc>
         <w:tc>
           <w:tcPr>
-            <w:tcW w:w="410" w:type="pct"/>
+            <w:tcW w:w="820" w:type="pct"/>
             <w:vMerge w:val="restart"/>
             <w:tcBorders>
               <w:top w:val="single" w:color="auto" w:sz="4" w:space="0"/>
@@ -3458,7 +3845,7 @@
         </w:tc>
         <w:tc>
           <w:tcPr>
-            <w:tcW w:w="410" w:type="pct"/>
+            <w:tcW w:w="765" w:type="pct"/>
             <w:vMerge w:val="restart"/>
             <w:tcBorders>
               <w:top w:val="single" w:color="auto" w:sz="4" w:space="0"/>
@@ -3522,7 +3909,7 @@
         </w:tc>
         <w:tc>
           <w:tcPr>
-            <w:tcW w:w="521" w:type="pct"/>
+            <w:tcW w:w="223" w:type="pct"/>
             <w:vMerge w:val="restart"/>
             <w:tcBorders>
               <w:top w:val="single" w:color="auto" w:sz="4" w:space="0"/>
@@ -3593,7 +3980,7 @@
         </w:tc>
         <w:tc>
           <w:tcPr>
-            <w:tcW w:w="450" w:type="pct"/>
+            <w:tcW w:w="878" w:type="pct"/>
             <w:vMerge w:val="restart"/>
             <w:tcBorders>
               <w:top w:val="single" w:color="auto" w:sz="4" w:space="0"/>
@@ -3682,7 +4069,7 @@
         </w:tblPrEx>
         <w:tc>
           <w:tcPr>
-            <w:tcW w:w="240" w:type="pct"/>
+            <w:tcW w:w="50" w:type="pct"/>
             <w:vMerge w:val="continue"/>
             <w:tcBorders>
               <w:top w:val="single" w:color="auto" w:sz="4" w:space="0"/>
@@ -3707,7 +4094,7 @@
         </w:tc>
         <w:tc>
           <w:tcPr>
-            <w:tcW w:w="585" w:type="pct"/>
+            <w:tcW w:w="105" w:type="pct"/>
             <w:vMerge w:val="continue"/>
             <w:tcBorders>
               <w:top w:val="single" w:color="auto" w:sz="4" w:space="0"/>
@@ -3732,7 +4119,7 @@
         </w:tc>
         <w:tc>
           <w:tcPr>
-            <w:tcW w:w="378" w:type="pct"/>
+            <w:tcW w:w="534" w:type="pct"/>
             <w:tcBorders>
               <w:top w:val="single" w:color="auto" w:sz="4" w:space="0"/>
               <w:left w:val="single" w:color="auto" w:sz="4" w:space="0"/>
@@ -3774,7 +4161,7 @@
         </w:tc>
         <w:tc>
           <w:tcPr>
-            <w:tcW w:w="772" w:type="pct"/>
+            <w:tcW w:w="558" w:type="pct"/>
             <w:tcBorders>
               <w:top w:val="single" w:color="auto" w:sz="4" w:space="0"/>
               <w:left w:val="single" w:color="auto" w:sz="4" w:space="0"/>
@@ -3810,7 +4197,7 @@
         </w:tc>
         <w:tc>
           <w:tcPr>
-            <w:tcW w:w="774" w:type="pct"/>
+            <w:tcW w:w="717" w:type="pct"/>
             <w:vMerge w:val="continue"/>
             <w:tcBorders>
               <w:top w:val="single" w:color="auto" w:sz="4" w:space="0"/>
@@ -3836,7 +4223,7 @@
         </w:tc>
         <w:tc>
           <w:tcPr>
-            <w:tcW w:w="459" w:type="pct"/>
+            <w:tcW w:w="347" w:type="pct"/>
             <w:vMerge w:val="continue"/>
             <w:tcBorders>
               <w:top w:val="single" w:color="auto" w:sz="4" w:space="0"/>
@@ -3861,7 +4248,7 @@
         </w:tc>
         <w:tc>
           <w:tcPr>
-            <w:tcW w:w="410" w:type="pct"/>
+            <w:tcW w:w="820" w:type="pct"/>
             <w:vMerge w:val="continue"/>
             <w:tcBorders>
               <w:top w:val="single" w:color="auto" w:sz="4" w:space="0"/>
@@ -3886,7 +4273,7 @@
         </w:tc>
         <w:tc>
           <w:tcPr>
-            <w:tcW w:w="410" w:type="pct"/>
+            <w:tcW w:w="765" w:type="pct"/>
             <w:vMerge w:val="continue"/>
             <w:tcBorders>
               <w:top w:val="single" w:color="auto" w:sz="4" w:space="0"/>
@@ -3912,7 +4299,7 @@
         </w:tc>
         <w:tc>
           <w:tcPr>
-            <w:tcW w:w="521" w:type="pct"/>
+            <w:tcW w:w="223" w:type="pct"/>
             <w:vMerge w:val="continue"/>
             <w:tcBorders>
               <w:top w:val="single" w:color="auto" w:sz="4" w:space="0"/>
@@ -3938,7 +4325,7 @@
         </w:tc>
         <w:tc>
           <w:tcPr>
-            <w:tcW w:w="450" w:type="pct"/>
+            <w:tcW w:w="878" w:type="pct"/>
             <w:vMerge w:val="continue"/>
             <w:tcBorders>
               <w:top w:val="single" w:color="auto" w:sz="4" w:space="0"/>
@@ -3985,7 +4372,7 @@
         </w:trPr>
         <w:tc>
           <w:tcPr>
-            <w:tcW w:w="240" w:type="pct"/>
+            <w:tcW w:w="50" w:type="pct"/>
             <w:tcBorders>
               <w:top w:val="single" w:color="auto" w:sz="4" w:space="0"/>
               <w:left w:val="single" w:color="auto" w:sz="4" w:space="0"/>
@@ -4015,7 +4402,7 @@
         </w:tc>
         <w:tc>
           <w:tcPr>
-            <w:tcW w:w="585" w:type="pct"/>
+            <w:tcW w:w="105" w:type="pct"/>
             <w:tcBorders>
               <w:top w:val="single" w:color="auto" w:sz="4" w:space="0"/>
               <w:left w:val="single" w:color="auto" w:sz="4" w:space="0"/>
@@ -4047,7 +4434,7 @@
         </w:tc>
         <w:tc>
           <w:tcPr>
-            <w:tcW w:w="378" w:type="pct"/>
+            <w:tcW w:w="534" w:type="pct"/>
             <w:tcBorders>
               <w:top w:val="single" w:color="auto" w:sz="4" w:space="0"/>
               <w:left w:val="single" w:color="auto" w:sz="4" w:space="0"/>
@@ -4068,17 +4455,41 @@
             </w:pPr>
             <w:r>
               <w:rPr>
-                <w:bCs/>
-                <w:sz w:val="22"/>
-                <w:szCs w:val="22"/>
-              </w:rPr>
-              <w:t>Thi công sửa chữa</w:t>
-            </w:r>
-          </w:p>
-        </w:tc>
-        <w:tc>
-          <w:tcPr>
-            <w:tcW w:w="772" w:type="pct"/>
+                <w:rFonts w:hint="default"/>
+                <w:bCs/>
+                <w:sz w:val="22"/>
+                <w:szCs w:val="22"/>
+                <w:highlight w:val="yellow"/>
+                <w:lang w:val="en-US"/>
+              </w:rPr>
+              <w:t>{</w:t>
+            </w:r>
+            <w:r>
+              <w:rPr>
+                <w:rFonts w:hint="default"/>
+                <w:sz w:val="22"/>
+                <w:szCs w:val="22"/>
+                <w:highlight w:val="yellow"/>
+                <w:lang w:val="en-US"/>
+              </w:rPr>
+              <w:t>TC_bid_package.name</w:t>
+            </w:r>
+            <w:r>
+              <w:rPr>
+                <w:rFonts w:hint="default"/>
+                <w:bCs/>
+                <w:sz w:val="22"/>
+                <w:szCs w:val="22"/>
+                <w:highlight w:val="yellow"/>
+                <w:lang w:val="en-US"/>
+              </w:rPr>
+              <w:t>}</w:t>
+            </w:r>
+          </w:p>
+        </w:tc>
+        <w:tc>
+          <w:tcPr>
+            <w:tcW w:w="558" w:type="pct"/>
             <w:tcBorders>
               <w:top w:val="single" w:color="auto" w:sz="4" w:space="0"/>
               <w:left w:val="single" w:color="auto" w:sz="4" w:space="0"/>
@@ -4099,16 +4510,41 @@
             </w:pPr>
             <w:r>
               <w:rPr>
-                <w:sz w:val="22"/>
-                <w:szCs w:val="22"/>
-              </w:rPr>
-              <w:t>Thực hiện công tác sửa chữa theo hồ sơ thiết kế, dự toán</w:t>
-            </w:r>
-          </w:p>
-        </w:tc>
-        <w:tc>
-          <w:tcPr>
-            <w:tcW w:w="774" w:type="pct"/>
+                <w:rFonts w:hint="default"/>
+                <w:bCs/>
+                <w:sz w:val="22"/>
+                <w:szCs w:val="22"/>
+                <w:highlight w:val="yellow"/>
+                <w:lang w:val="en-US"/>
+              </w:rPr>
+              <w:t>{</w:t>
+            </w:r>
+            <w:r>
+              <w:rPr>
+                <w:rFonts w:hint="default"/>
+                <w:sz w:val="22"/>
+                <w:szCs w:val="22"/>
+                <w:highlight w:val="yellow"/>
+                <w:lang w:val="en-US"/>
+              </w:rPr>
+              <w:t>TC_bid_package.</w:t>
+            </w:r>
+            <w:r>
+              <w:rPr>
+                <w:rFonts w:hint="default"/>
+                <w:bCs/>
+                <w:sz w:val="22"/>
+                <w:szCs w:val="22"/>
+                <w:highlight w:val="yellow"/>
+                <w:lang w:val="en-US"/>
+              </w:rPr>
+              <w:t>short_desc}</w:t>
+            </w:r>
+          </w:p>
+        </w:tc>
+        <w:tc>
+          <w:tcPr>
+            <w:tcW w:w="717" w:type="pct"/>
             <w:tcBorders>
               <w:top w:val="single" w:color="auto" w:sz="4" w:space="0"/>
               <w:left w:val="single" w:color="auto" w:sz="4" w:space="0"/>
@@ -4123,24 +4559,28 @@
               <w:spacing w:before="120" w:after="120"/>
               <w:jc w:val="center"/>
               <w:rPr>
+                <w:rFonts w:hint="default"/>
                 <w:sz w:val="22"/>
                 <w:szCs w:val="22"/>
                 <w:highlight w:val="yellow"/>
-              </w:rPr>
-            </w:pPr>
-            <w:r>
-              <w:rPr>
+                <w:lang w:val="en-US"/>
+              </w:rPr>
+            </w:pPr>
+            <w:r>
+              <w:rPr>
+                <w:rFonts w:hint="default"/>
                 <w:sz w:val="22"/>
                 <w:szCs w:val="22"/>
                 <w:highlight w:val="yellow"/>
-              </w:rPr>
-              <w:t>743.756.519</w:t>
-            </w:r>
-          </w:p>
-        </w:tc>
-        <w:tc>
-          <w:tcPr>
-            <w:tcW w:w="459" w:type="pct"/>
+                <w:lang w:val="en-US"/>
+              </w:rPr>
+              <w:t>{TC_bid_package.est_cost}</w:t>
+            </w:r>
+          </w:p>
+        </w:tc>
+        <w:tc>
+          <w:tcPr>
+            <w:tcW w:w="347" w:type="pct"/>
             <w:tcBorders>
               <w:top w:val="single" w:color="auto" w:sz="4" w:space="0"/>
               <w:left w:val="single" w:color="auto" w:sz="4" w:space="0"/>
@@ -4155,9 +4595,11 @@
               <w:spacing w:before="120" w:after="120"/>
               <w:jc w:val="center"/>
               <w:rPr>
-                <w:bCs/>
-                <w:sz w:val="22"/>
-                <w:szCs w:val="22"/>
+                <w:rFonts w:hint="default"/>
+                <w:bCs/>
+                <w:sz w:val="22"/>
+                <w:szCs w:val="22"/>
+                <w:lang w:val="en-US"/>
               </w:rPr>
             </w:pPr>
             <w:r>
@@ -4169,17 +4611,19 @@
             </w:r>
             <w:r>
               <w:rPr>
+                <w:rFonts w:hint="default"/>
                 <w:sz w:val="22"/>
                 <w:szCs w:val="22"/>
                 <w:highlight w:val="yellow"/>
-              </w:rPr>
-              <w:t>2025</w:t>
-            </w:r>
-          </w:p>
-        </w:tc>
-        <w:tc>
-          <w:tcPr>
-            <w:tcW w:w="410" w:type="pct"/>
+                <w:lang w:val="en-US"/>
+              </w:rPr>
+              <w:t>{source_of_funds}</w:t>
+            </w:r>
+          </w:p>
+        </w:tc>
+        <w:tc>
+          <w:tcPr>
+            <w:tcW w:w="820" w:type="pct"/>
             <w:tcBorders>
               <w:top w:val="single" w:color="auto" w:sz="4" w:space="0"/>
               <w:left w:val="single" w:color="auto" w:sz="4" w:space="0"/>
@@ -4191,24 +4635,6 @@
           </w:tcPr>
           <w:p>
             <w:pPr>
-              <w:jc w:val="center"/>
-              <w:rPr>
-                <w:bCs/>
-                <w:sz w:val="22"/>
-                <w:szCs w:val="22"/>
-              </w:rPr>
-            </w:pPr>
-            <w:r>
-              <w:rPr>
-                <w:bCs/>
-                <w:sz w:val="22"/>
-                <w:szCs w:val="22"/>
-              </w:rPr>
-              <w:t>Chỉ định thầu</w:t>
-            </w:r>
-          </w:p>
-          <w:p>
-            <w:pPr>
               <w:spacing w:after="120"/>
               <w:jc w:val="center"/>
               <w:rPr>
@@ -4219,17 +4645,41 @@
             </w:pPr>
             <w:r>
               <w:rPr>
-                <w:bCs/>
-                <w:sz w:val="22"/>
-                <w:szCs w:val="22"/>
-              </w:rPr>
-              <w:t>rút gọn</w:t>
-            </w:r>
-          </w:p>
-        </w:tc>
-        <w:tc>
-          <w:tcPr>
-            <w:tcW w:w="410" w:type="pct"/>
+                <w:rFonts w:hint="default"/>
+                <w:bCs/>
+                <w:sz w:val="22"/>
+                <w:szCs w:val="22"/>
+                <w:highlight w:val="yellow"/>
+                <w:lang w:val="en-US"/>
+              </w:rPr>
+              <w:t>{</w:t>
+            </w:r>
+            <w:r>
+              <w:rPr>
+                <w:rFonts w:hint="default"/>
+                <w:sz w:val="22"/>
+                <w:szCs w:val="22"/>
+                <w:highlight w:val="yellow"/>
+                <w:lang w:val="en-US"/>
+              </w:rPr>
+              <w:t>TC_bid_package.</w:t>
+            </w:r>
+            <w:r>
+              <w:rPr>
+                <w:rFonts w:hint="default"/>
+                <w:bCs/>
+                <w:sz w:val="22"/>
+                <w:szCs w:val="22"/>
+                <w:highlight w:val="yellow"/>
+                <w:lang w:val="en-US"/>
+              </w:rPr>
+              <w:t>bidder_selection_method}</w:t>
+            </w:r>
+          </w:p>
+        </w:tc>
+        <w:tc>
+          <w:tcPr>
+            <w:tcW w:w="765" w:type="pct"/>
             <w:tcBorders>
               <w:top w:val="single" w:color="auto" w:sz="4" w:space="0"/>
               <w:left w:val="single" w:color="auto" w:sz="4" w:space="0"/>
@@ -4244,25 +4694,50 @@
               <w:spacing w:before="120" w:after="120"/>
               <w:jc w:val="center"/>
               <w:rPr>
-                <w:bCs/>
-                <w:sz w:val="22"/>
-                <w:szCs w:val="22"/>
-              </w:rPr>
-            </w:pPr>
-            <w:r>
-              <w:rPr>
+                <w:rFonts w:hint="default"/>
+                <w:bCs/>
+                <w:sz w:val="22"/>
+                <w:szCs w:val="22"/>
+                <w:lang w:val="en-US"/>
+              </w:rPr>
+            </w:pPr>
+            <w:r>
+              <w:rPr>
+                <w:rFonts w:hint="default"/>
                 <w:bCs/>
                 <w:sz w:val="22"/>
                 <w:szCs w:val="22"/>
                 <w:highlight w:val="yellow"/>
-              </w:rPr>
-              <w:t>Tháng 10/2025</w:t>
-            </w:r>
-          </w:p>
-        </w:tc>
-        <w:tc>
-          <w:tcPr>
-            <w:tcW w:w="521" w:type="pct"/>
+                <w:lang w:val="en-US"/>
+              </w:rPr>
+              <w:t>{</w:t>
+            </w:r>
+            <w:r>
+              <w:rPr>
+                <w:rFonts w:hint="default"/>
+                <w:sz w:val="22"/>
+                <w:szCs w:val="22"/>
+                <w:highlight w:val="yellow"/>
+                <w:lang w:val="en-US"/>
+              </w:rPr>
+              <w:t>TC_bid_package.</w:t>
+            </w:r>
+            <w:r>
+              <w:rPr>
+                <w:rFonts w:hint="default"/>
+                <w:bCs/>
+                <w:sz w:val="22"/>
+                <w:szCs w:val="22"/>
+                <w:highlight w:val="yellow"/>
+                <w:lang w:val="en-US"/>
+              </w:rPr>
+              <w:t>bidder_selection_time}</w:t>
+            </w:r>
+          </w:p>
+        </w:tc>
+        <w:tc>
+          <w:tcPr>
+            <w:tcW w:w="223" w:type="pct"/>
             <w:tcBorders>
               <w:top w:val="single" w:color="auto" w:sz="4" w:space="0"/>
               <w:left w:val="single" w:color="auto" w:sz="4" w:space="0"/>
@@ -4300,7 +4775,7 @@
         </w:tc>
         <w:tc>
           <w:tcPr>
-            <w:tcW w:w="450" w:type="pct"/>
+            <w:tcW w:w="878" w:type="pct"/>
             <w:tcBorders>
               <w:top w:val="single" w:color="auto" w:sz="4" w:space="0"/>
               <w:left w:val="single" w:color="auto" w:sz="4" w:space="0"/>
@@ -4321,19 +4796,33 @@
               <w:spacing w:before="120" w:after="120"/>
               <w:jc w:val="center"/>
               <w:rPr>
-                <w:bCs/>
-                <w:sz w:val="22"/>
-                <w:szCs w:val="22"/>
-              </w:rPr>
-            </w:pPr>
-            <w:r>
-              <w:rPr>
+                <w:rFonts w:hint="default"/>
+                <w:bCs/>
+                <w:sz w:val="22"/>
+                <w:szCs w:val="22"/>
+                <w:lang w:val="en-US"/>
+              </w:rPr>
+            </w:pPr>
+            <w:r>
+              <w:rPr>
+                <w:rFonts w:hint="default"/>
                 <w:bCs/>
                 <w:sz w:val="22"/>
                 <w:szCs w:val="22"/>
                 <w:highlight w:val="yellow"/>
-              </w:rPr>
-              <w:t>30 ngày</w:t>
+                <w:lang w:val="en-US"/>
+              </w:rPr>
+              <w:t>{</w:t>
+            </w:r>
+            <w:r>
+              <w:rPr>
+                <w:rFonts w:hint="default"/>
+                <w:sz w:val="22"/>
+                <w:szCs w:val="22"/>
+                <w:highlight w:val="yellow"/>
+                <w:lang w:val="en-US"/>
+              </w:rPr>
+              <w:t>TC_bid_package.bidder_selection_time}</w:t>
             </w:r>
           </w:p>
         </w:tc>
@@ -4360,7 +4849,7 @@
         </w:trPr>
         <w:tc>
           <w:tcPr>
-            <w:tcW w:w="1975" w:type="pct"/>
+            <w:tcW w:w="1247" w:type="pct"/>
             <w:gridSpan w:val="4"/>
             <w:tcBorders>
               <w:top w:val="single" w:color="auto" w:sz="4" w:space="0"/>
@@ -4395,7 +4884,7 @@
         </w:tc>
         <w:tc>
           <w:tcPr>
-            <w:tcW w:w="774" w:type="pct"/>
+            <w:tcW w:w="717" w:type="pct"/>
             <w:tcBorders>
               <w:top w:val="single" w:color="auto" w:sz="4" w:space="0"/>
               <w:left w:val="single" w:color="auto" w:sz="4" w:space="0"/>
@@ -4416,27 +4905,31 @@
               <w:spacing w:before="120" w:after="120"/>
               <w:jc w:val="center"/>
               <w:rPr>
+                <w:rFonts w:hint="default"/>
                 <w:b/>
                 <w:bCs/>
                 <w:sz w:val="22"/>
                 <w:szCs w:val="22"/>
                 <w:highlight w:val="yellow"/>
-              </w:rPr>
-            </w:pPr>
-            <w:r>
-              <w:rPr>
+                <w:lang w:val="en-US"/>
+              </w:rPr>
+            </w:pPr>
+            <w:r>
+              <w:rPr>
+                <w:rFonts w:hint="default"/>
                 <w:b/>
                 <w:sz w:val="22"/>
                 <w:szCs w:val="22"/>
                 <w:highlight w:val="yellow"/>
-              </w:rPr>
-              <w:t>743.756.519</w:t>
-            </w:r>
-          </w:p>
-        </w:tc>
-        <w:tc>
-          <w:tcPr>
-            <w:tcW w:w="459" w:type="pct"/>
+                <w:lang w:val="en-US"/>
+              </w:rPr>
+              <w:t>{bidder_selection_works_total}</w:t>
+            </w:r>
+          </w:p>
+        </w:tc>
+        <w:tc>
+          <w:tcPr>
+            <w:tcW w:w="347" w:type="pct"/>
             <w:tcBorders>
               <w:top w:val="single" w:color="auto" w:sz="4" w:space="0"/>
               <w:left w:val="single" w:color="auto" w:sz="4" w:space="0"/>
@@ -4466,7 +4959,7 @@
         </w:tc>
         <w:tc>
           <w:tcPr>
-            <w:tcW w:w="410" w:type="pct"/>
+            <w:tcW w:w="820" w:type="pct"/>
             <w:tcBorders>
               <w:top w:val="single" w:color="auto" w:sz="4" w:space="0"/>
               <w:left w:val="single" w:color="auto" w:sz="4" w:space="0"/>
@@ -4496,7 +4989,7 @@
         </w:tc>
         <w:tc>
           <w:tcPr>
-            <w:tcW w:w="410" w:type="pct"/>
+            <w:tcW w:w="765" w:type="pct"/>
             <w:tcBorders>
               <w:top w:val="single" w:color="auto" w:sz="4" w:space="0"/>
               <w:left w:val="single" w:color="auto" w:sz="4" w:space="0"/>
@@ -4519,7 +5012,7 @@
         </w:tc>
         <w:tc>
           <w:tcPr>
-            <w:tcW w:w="521" w:type="pct"/>
+            <w:tcW w:w="223" w:type="pct"/>
             <w:tcBorders>
               <w:top w:val="single" w:color="auto" w:sz="4" w:space="0"/>
               <w:left w:val="single" w:color="auto" w:sz="4" w:space="0"/>
@@ -4549,7 +5042,7 @@
         </w:tc>
         <w:tc>
           <w:tcPr>
-            <w:tcW w:w="450" w:type="pct"/>
+            <w:tcW w:w="878" w:type="pct"/>
             <w:tcBorders>
               <w:top w:val="single" w:color="auto" w:sz="4" w:space="0"/>
               <w:left w:val="single" w:color="auto" w:sz="4" w:space="0"/>
@@ -4650,9 +5143,23 @@
       </w:r>
       <w:r>
         <w:rPr>
+          <w:rFonts w:hint="default"/>
+          <w:sz w:val="28"/>
+          <w:szCs w:val="28"/>
           <w:highlight w:val="yellow"/>
-        </w:rPr>
-        <w:t>2025</w:t>
+          <w:lang w:val="en-US"/>
+        </w:rPr>
+        <w:t>{source_of_funds</w:t>
+      </w:r>
+      <w:r>
+        <w:rPr>
+          <w:rFonts w:hint="default"/>
+          <w:sz w:val="32"/>
+          <w:szCs w:val="32"/>
+          <w:highlight w:val="yellow"/>
+          <w:lang w:val="en-US"/>
+        </w:rPr>
+        <w:t>}</w:t>
       </w:r>
       <w:r>
         <w:rPr>
@@ -4718,12 +5225,23 @@
       </w:r>
       <w:r>
         <w:rPr>
+          <w:rFonts w:hint="default"/>
+          <w:sz w:val="28"/>
+          <w:szCs w:val="28"/>
           <w:highlight w:val="yellow"/>
-        </w:rPr>
-        <w:t>Tháng 10/2025</w:t>
-      </w:r>
-      <w:r>
-        <w:t xml:space="preserve">. </w:t>
+          <w:lang w:val="en-US"/>
+        </w:rPr>
+        <w:t>{TC_bid_package.bidder_selection_time}</w:t>
+      </w:r>
+      <w:r>
+        <w:rPr>
+          <w:sz w:val="28"/>
+          <w:szCs w:val="28"/>
+        </w:rPr>
+        <w:t>.</w:t>
+      </w:r>
+      <w:r>
+        <w:t xml:space="preserve"> </w:t>
       </w:r>
     </w:p>
     <w:p>
@@ -5144,9 +5662,9 @@
         </w:tblCellMar>
       </w:tblPr>
       <w:tblGrid>
-        <w:gridCol w:w="815"/>
-        <w:gridCol w:w="6361"/>
-        <w:gridCol w:w="2111"/>
+        <w:gridCol w:w="794"/>
+        <w:gridCol w:w="4695"/>
+        <w:gridCol w:w="3798"/>
       </w:tblGrid>
       <w:tr>
         <w:tblPrEx>
@@ -5323,16 +5841,19 @@
               <w:widowControl w:val="0"/>
               <w:jc w:val="right"/>
               <w:rPr>
-                <w:bCs/>
-                <w:lang w:val="nb-NO"/>
-              </w:rPr>
-            </w:pPr>
-            <w:r>
-              <w:rPr>
+                <w:rFonts w:hint="default"/>
+                <w:bCs/>
+                <w:lang w:val="en-US"/>
+              </w:rPr>
+            </w:pPr>
+            <w:r>
+              <w:rPr>
+                <w:rFonts w:hint="default"/>
                 <w:bCs/>
                 <w:highlight w:val="yellow"/>
-              </w:rPr>
-              <w:t>48.321.878</w:t>
+                <w:lang w:val="en-US"/>
+              </w:rPr>
+              <w:t>{completed_works_total}</w:t>
             </w:r>
           </w:p>
         </w:tc>
@@ -5496,12 +6017,18 @@
             <w:pPr>
               <w:widowControl w:val="0"/>
               <w:jc w:val="right"/>
-            </w:pPr>
-            <w:r>
-              <w:rPr>
+              <w:rPr>
+                <w:rFonts w:hint="default"/>
+                <w:lang w:val="en-US"/>
+              </w:rPr>
+            </w:pPr>
+            <w:r>
+              <w:rPr>
+                <w:rFonts w:hint="default"/>
                 <w:highlight w:val="yellow"/>
-              </w:rPr>
-              <w:t>743.756.519</w:t>
+                <w:lang w:val="en-US"/>
+              </w:rPr>
+              <w:t>{bidder_selection_works_total}</w:t>
             </w:r>
           </w:p>
         </w:tc>
@@ -5651,19 +6178,22 @@
               <w:widowControl w:val="0"/>
               <w:jc w:val="right"/>
               <w:rPr>
+                <w:rFonts w:hint="default"/>
                 <w:b/>
                 <w:bCs/>
                 <w:highlight w:val="yellow"/>
-                <w:lang w:val="nb-NO"/>
-              </w:rPr>
-            </w:pPr>
-            <w:r>
-              <w:rPr>
+                <w:lang w:val="en-US"/>
+              </w:rPr>
+            </w:pPr>
+            <w:r>
+              <w:rPr>
+                <w:rFonts w:hint="default"/>
                 <w:b/>
                 <w:bCs/>
                 <w:highlight w:val="yellow"/>
-              </w:rPr>
-              <w:t>792.078.397</w:t>
+                <w:lang w:val="en-US"/>
+              </w:rPr>
+              <w:t>{est_cost}</w:t>
             </w:r>
           </w:p>
         </w:tc>
@@ -5722,19 +6252,22 @@
               <w:widowControl w:val="0"/>
               <w:jc w:val="right"/>
               <w:rPr>
+                <w:rFonts w:hint="default"/>
                 <w:b/>
                 <w:bCs/>
                 <w:highlight w:val="yellow"/>
-                <w:lang w:val="nb-NO"/>
-              </w:rPr>
-            </w:pPr>
-            <w:r>
-              <w:rPr>
+                <w:lang w:val="en-US"/>
+              </w:rPr>
+            </w:pPr>
+            <w:r>
+              <w:rPr>
+                <w:rFonts w:hint="default"/>
                 <w:b/>
                 <w:bCs/>
                 <w:highlight w:val="yellow"/>
-              </w:rPr>
-              <w:t>792.078.397</w:t>
+                <w:lang w:val="en-US"/>
+              </w:rPr>
+              <w:t>{est_cost}</w:t>
             </w:r>
           </w:p>
         </w:tc>
@@ -6296,7 +6829,7 @@
     <w:lsdException w:unhideWhenUsed="0" w:uiPriority="0" w:semiHidden="0" w:name="footnote text"/>
     <w:lsdException w:unhideWhenUsed="0" w:uiPriority="0" w:semiHidden="0" w:name="annotation text"/>
     <w:lsdException w:qFormat="1" w:unhideWhenUsed="0" w:uiPriority="0" w:semiHidden="0" w:name="header"/>
-    <w:lsdException w:unhideWhenUsed="0" w:uiPriority="0" w:semiHidden="0" w:name="footer"/>
+    <w:lsdException w:qFormat="1" w:unhideWhenUsed="0" w:uiPriority="0" w:semiHidden="0" w:name="footer"/>
     <w:lsdException w:unhideWhenUsed="0" w:uiPriority="0" w:semiHidden="0" w:name="index heading"/>
     <w:lsdException w:qFormat="1" w:uiPriority="0" w:name="caption"/>
     <w:lsdException w:unhideWhenUsed="0" w:uiPriority="0" w:semiHidden="0" w:name="table of figures"/>
@@ -6411,7 +6944,7 @@
     <w:lsdException w:unhideWhenUsed="0" w:uiPriority="0" w:semiHidden="0" w:name="Table Web 1"/>
     <w:lsdException w:unhideWhenUsed="0" w:uiPriority="0" w:semiHidden="0" w:name="Table Web 2"/>
     <w:lsdException w:unhideWhenUsed="0" w:uiPriority="0" w:semiHidden="0" w:name="Table Web 3"/>
-    <w:lsdException w:unhideWhenUsed="0" w:uiPriority="0" w:semiHidden="0" w:name="Balloon Text"/>
+    <w:lsdException w:qFormat="1" w:unhideWhenUsed="0" w:uiPriority="0" w:semiHidden="0" w:name="Balloon Text"/>
     <w:lsdException w:qFormat="1" w:unhideWhenUsed="0" w:uiPriority="0" w:semiHidden="0" w:name="Table Grid"/>
     <w:lsdException w:unhideWhenUsed="0" w:uiPriority="0" w:semiHidden="0" w:name="Table Theme"/>
     <w:lsdException w:unhideWhenUsed="0" w:uiPriority="60" w:semiHidden="0" w:name="Light Shading"/>
@@ -6580,6 +7113,7 @@
     <w:name w:val="Balloon Text"/>
     <w:basedOn w:val="1"/>
     <w:link w:val="17"/>
+    <w:qFormat/>
     <w:uiPriority w:val="0"/>
     <w:rPr>
       <w:rFonts w:ascii="Segoe UI" w:hAnsi="Segoe UI" w:cs="Segoe UI"/>
@@ -6605,6 +7139,7 @@
   <w:style w:type="paragraph" w:styleId="8">
     <w:name w:val="footer"/>
     <w:basedOn w:val="1"/>
+    <w:qFormat/>
     <w:uiPriority w:val="0"/>
     <w:pPr>
       <w:tabs>

</xml_diff>